<commit_message>
feat: initialize project documentation framework with dynamic export capabilities and utility modules
</commit_message>
<xml_diff>
--- a/docs/files/exports/template-excel-template-application-pricing-calculator.docx
+++ b/docs/files/exports/template-excel-template-application-pricing-calculator.docx
@@ -17,7 +17,7 @@
     </w:p>
     <w:p>
       <w:r>
-        <w:t>Generated: 2026-07-28 13:56</w:t>
+        <w:t>Generated: 2026-07-28 14:02</w:t>
       </w:r>
     </w:p>
     <w:p>
@@ -30,7 +30,7 @@
     </w:p>
     <w:p>
       <w:r>
-        <w:t>Excel Spreadsheet containing 3 sheet(s) and 191 rows of data.</w:t>
+        <w:t>Interactive Pricing Calculator with 3 sheet(s) and 191 configurable line-items.</w:t>
       </w:r>
     </w:p>
     <w:sectPr>

</xml_diff>